<commit_message>
Update resume example text for clarity and relevance to internship applications
</commit_message>
<xml_diff>
--- a/miscellaneous/example-resume.docx
+++ b/miscellaneous/example-resume.docx
@@ -723,8 +723,8 @@
       <w:rPr>
         <w:rFonts w:ascii="Arial" w:cs="Arial" w:eastAsia="Arial" w:hAnsi="Arial"/>
         <w:color w:val="595959"/>
-        <w:sz w:val="17"/>
-        <w:szCs w:val="17"/>
+        <w:sz w:val="18"/>
+        <w:szCs w:val="18"/>
       </w:rPr>
       <w:t xml:space="preserve">This example was created by </w:t>
     </w:r>
@@ -733,8 +733,8 @@
         <w:rPr>
           <w:rFonts w:ascii="Arial" w:cs="Arial" w:eastAsia="Arial" w:hAnsi="Arial"/>
           <w:color w:val="0563C1"/>
-          <w:sz w:val="17"/>
-          <w:szCs w:val="17"/>
+          <w:sz w:val="18"/>
+          <w:szCs w:val="18"/>
           <w:u w:val="single"/>
         </w:rPr>
         <w:t xml:space="preserve">Segun Akinyemi</w:t>
@@ -744,33 +744,33 @@
       <w:rPr>
         <w:rFonts w:ascii="Arial" w:cs="Arial" w:eastAsia="Arial" w:hAnsi="Arial"/>
         <w:color w:val="595959"/>
-        <w:sz w:val="17"/>
-        <w:szCs w:val="17"/>
+        <w:sz w:val="18"/>
+        <w:szCs w:val="18"/>
       </w:rPr>
-      <w:t xml:space="preserve"> based on the resume of a student who successfully interviewed with him and other Microsoft engineers in September 2026 for a software engineering internship focused on AI. The interviews included an </w:t>
+      <w:t xml:space="preserve"> based on the resume of a student who successfully interviewed with him and other Microsoft engineers in September 2026 for a software engineering internship. Every detail was changed except the format and patterns. The interviews included an </w:t>
     </w:r>
     <w:hyperlink w:history="1" r:id="rIdo5dmin-bx2wf4gm3vdc8k">
       <w:r>
         <w:rPr>
           <w:rFonts w:ascii="Arial" w:cs="Arial" w:eastAsia="Arial" w:hAnsi="Arial"/>
           <w:color w:val="0563C1"/>
-          <w:sz w:val="17"/>
-          <w:szCs w:val="17"/>
+          <w:sz w:val="18"/>
+          <w:szCs w:val="18"/>
           <w:u w:val="single"/>
         </w:rPr>
         <w:t xml:space="preserve">AI</w:t>
         <w:noBreakHyphen/>
-        <w:t xml:space="preserve">assisted coding round on HackerRank</w:t>
+        <w:t xml:space="preserve">assisted technical round on HackerRank</w:t>
       </w:r>
     </w:hyperlink>
     <w:r>
       <w:rPr>
         <w:rFonts w:ascii="Arial" w:cs="Arial" w:eastAsia="Arial" w:hAnsi="Arial"/>
         <w:color w:val="595959"/>
-        <w:sz w:val="17"/>
-        <w:szCs w:val="17"/>
+        <w:sz w:val="18"/>
+        <w:szCs w:val="18"/>
       </w:rPr>
-      <w:t xml:space="preserve">, where candidates can use AI while they code. The details here are fictional, but the patterns are real.</w:t>
+      <w:t xml:space="preserve">. We know this resume format made it past the AI ATS scanning software most companies are using now, so its patterns should be a good starting place for building a successful resume when looking for tech internships.</w:t>
     </w:r>
   </w:p>
   <w:p>
@@ -784,8 +784,8 @@
         <w:b/>
         <w:bCs/>
         <w:color w:val="595959"/>
-        <w:sz w:val="17"/>
-        <w:szCs w:val="17"/>
+        <w:sz w:val="18"/>
+        <w:szCs w:val="18"/>
       </w:rPr>
       <w:t xml:space="preserve">Delete this note before you use this resume.</w:t>
     </w:r>

</xml_diff>